<commit_message>
docs: add real-data validation section to the reversal investigation writeup
Adds Section 3.7 covering the MNIST difficulty sweep's confirmation
(r=0.763) of the task-difficulty account on real image data, updates the
limitations section accordingly, and points the publication framing at
both the synthetic and real-data demonstrations.
</commit_message>
<xml_diff>
--- a/disturbance_reversal_investigation.docx
+++ b/disturbance_reversal_investigation.docx
@@ -12,7 +12,7 @@
     </w:p>
     <w:p>
       <w:r>
-        <w:t>A seven-notebook investigation resolving why the reactive homeostatic controller's disturbance-benefit pattern reverses between the project's original toy task and real-data experiments. Prepared 2026-09-08. Source notebooks (all committed to bio_ai_homeostasis's git repository): followup_adam_adaptivity_hypothesis.ipynb, followup_architecture_hypothesis.ipynb, followup_bigger_architecture_hypothesis.ipynb, followup_task_realism_hypothesis.ipynb, followup_factorial_realism_hypothesis.ipynb, followup_output_head_isolation_hypothesis.ipynb, followup_center_seed_sweep_hypothesis.ipynb.</w:t>
+        <w:t>An eight-notebook investigation resolving why the reactive homeostatic controller's disturbance-benefit pattern reverses between the project's original toy task and real-data experiments, including validation of the final conclusion on real image data. Prepared 2026-09-08, updated 2026-09-09. Source notebooks (all committed to bio_ai_homeostasis's git repository): followup_adam_adaptivity_hypothesis.ipynb, followup_architecture_hypothesis.ipynb, followup_bigger_architecture_hypothesis.ipynb, followup_task_realism_hypothesis.ipynb, followup_factorial_realism_hypothesis.ipynb, followup_output_head_isolation_hypothesis.ipynb, followup_center_seed_sweep_hypothesis.ipynb, followup_mnist_difficulty_sweep.ipynb.</w:t>
       </w:r>
     </w:p>
     <w:p>
@@ -219,7 +219,7 @@
         <w:pStyle w:val="Heading1"/>
       </w:pPr>
       <w:r>
-        <w:t>3. Systematic Elimination: Seven Follow-Up Notebooks</w:t>
+        <w:t>3. Systematic Elimination: Eight Follow-Up Notebooks</w:t>
       </w:r>
     </w:p>
     <w:p>
@@ -302,6 +302,19 @@
     </w:p>
     <w:p>
       <w:pPr>
+        <w:pStyle w:val="Heading2"/>
+      </w:pPr>
+      <w:r>
+        <w:t>3.7 Follow-Up D -- Validation on Real Data (MNIST Difficulty Sweep)</w:t>
+      </w:r>
+    </w:p>
+    <w:p>
+      <w:r>
+        <w:t>followup_mnist_difficulty_sweep.ipynb tested whether the difficulty/separability account (Section 3.6) generalizes beyond the synthetic toy task. Reusing step23a's exact MLP (784-256-128-10) and controller mechanism unchanged, a continuous difficulty knob was introduced: constant additive Gaussian pixel noise (std in {0.0, 0.4, 0.8, 1.2, 1.6}) applied to every MNIST training batch throughout training, analogous to shrinking inter-class distance in the toy task. n=15 seeds, instability disturbance only, 10 Holm-corrected tests. Result: a clean r=0.763 correlation between added noise and instability A-vs-C effect size (all 10 tests Holm-significant), growing monotonically from d=2.55 (no added noise) to d=4.27 (heaviest noise). Notably, even at zero added noise the effect was already large (d=2.55) -- consistent with plain 10-class MNIST being an inherently harder, lower-margin problem than the toy task's easy 2D/2-class setup even without any manipulation, which is exactly why step23a and step23b showed a large instability-benefit natively while the original toy task did not. This is the first fully confirmatory result in the arc: unlike Sections 3.4-3.6, no unexamined confound was found on inspection -- the effect appeared exactly as the difficulty account predicted on the first attempt.</w:t>
+      </w:r>
+    </w:p>
+    <w:p>
+      <w:pPr>
         <w:pStyle w:val="Heading1"/>
       </w:pPr>
       <w:r>
@@ -318,7 +331,7 @@
     </w:p>
     <w:p>
       <w:r>
-        <w:t>This is simpler than, and subsumes, every earlier attribution investigated along the way: architecture size, task realism (multi-class and high-dimensionality), output-head/loss formulation, and center-placement "randomness" were each, in turn, just different ways of making the task harder or easier -- not independent causal factors. It also retroactively explains the task-realism notebook's very large effect (Section 3.3): a 10-way, 20-dimensional classification task at the same fixed per-sample noise scale is simply a much harder, lower-margin problem than the toy 2D/2-class task, fully consistent with the difficulty account rather than contradicting it.</w:t>
+        <w:t>This is simpler than, and subsumes, every earlier attribution investigated along the way: architecture size, task realism (multi-class and high-dimensionality), output-head/loss formulation, and center-placement "randomness" were each, in turn, just different ways of making the task harder or easier -- not independent causal factors. It also retroactively explains the task-realism notebook's very large effect (Section 3.3): a 10-way, 20-dimensional classification task at the same fixed per-sample noise scale is simply a much harder, lower-margin problem than the toy 2D/2-class task, fully consistent with the difficulty account rather than contradicting it. Section 3.7 confirms this account also holds on real image data (MNIST), not just the synthetic toy task.</w:t>
       </w:r>
     </w:p>
     <w:p>
@@ -355,7 +368,7 @@
         <w:pStyle w:val="ListBullet"/>
       </w:pPr>
       <w:r>
-        <w:t>All experiments in this arc use a synthetic 2D (or D-dimensional) Gaussian-cluster toy task with a fixed per-sample noise scale of 1.0. The "distance relative to noise scale" framing has not been validated on real image or sequence data, where an equivalent difficulty/margin measure would need to be defined differently.</w:t>
+        <w:t>The core distance-based demonstration (Section 3.6) uses a synthetic 2D Gaussian-cluster toy task with a fixed per-sample noise scale of 1.0. Section 3.7 validates the qualitative difficulty account (harder task -&gt; larger controller benefit) on real MNIST data using a different difficulty operationalization (added pixel noise, not inter-class distance), and finds the same direction of effect (r=0.763) -- but this is one operationalization on one real dataset, not a general proof that any difficulty manipulation on any dataset will show the same pattern.</w:t>
       </w:r>
     </w:p>
     <w:p>
@@ -384,7 +397,7 @@
     </w:p>
     <w:p>
       <w:r>
-        <w:t>Report this arc as a single task-difficulty-dependent effect, using the center-seed sweep as the controlled, quantitative demonstration (Section 3.6 and 4). Describe the architecture, task-realism, and output-head investigations as ruled-out alternative explanations examined en route to that conclusion, not as separate findings each contributing part of the answer -- citing them as contributing causes would repeat the confound this investigation spent three rounds resolving. The Qwen3-0.6B+LoRA null (Section 5) should be flagged as an open question under this account, not silently dropped.</w:t>
+        <w:t>Report this arc as a single task-difficulty-dependent effect, using the center-seed sweep (Section 3.6) as the controlled, quantitative demonstration on synthetic data and the MNIST difficulty sweep (Section 3.7) as independent validation on real data. Describe the architecture, task-realism, and output-head investigations as ruled-out alternative explanations examined en route to that conclusion, not as separate findings each contributing part of the answer -- citing them as contributing causes would repeat the confound this investigation spent three rounds resolving. The Qwen3-0.6B+LoRA null (Section 5) should be flagged as an open question under this account, not silently dropped.</w:t>
       </w:r>
     </w:p>
     <w:sectPr>

</xml_diff>

<commit_message>
docs: add Qwen3-0.6B+LoRA null addendum to writeup and changelog
Records the three ruled-out explanations for step23c's null (task
difficulty, LoRA capacity, window length) and the Cohen's-d
low-variance-artifact caution surfaced along the way.
</commit_message>
<xml_diff>
--- a/disturbance_reversal_investigation.docx
+++ b/disturbance_reversal_investigation.docx
@@ -400,6 +400,53 @@
         <w:t>Report this arc as a single task-difficulty-dependent effect, using the center-seed sweep (Section 3.6) as the controlled, quantitative demonstration on synthetic data and the MNIST difficulty sweep (Section 3.7) as independent validation on real data. Describe the architecture, task-realism, and output-head investigations as ruled-out alternative explanations examined en route to that conclusion, not as separate findings each contributing part of the answer -- citing them as contributing causes would repeat the confound this investigation spent three rounds resolving. The Qwen3-0.6B+LoRA null (Section 5) should be flagged as an open question under this account, not silently dropped.</w:t>
       </w:r>
     </w:p>
+    <w:p>
+      <w:pPr>
+        <w:pStyle w:val="Heading1"/>
+      </w:pPr>
+      <w:r>
+        <w:t>8. Addendum: The Qwen3-0.6B+LoRA Null (Separate Follow-Up)</w:t>
+      </w:r>
+    </w:p>
+    <w:p>
+      <w:r>
+        <w:t>Section 5 flagged step23c's Qwen3-0.6B+LoRA null as an open tension under the task-difficulty account. This was investigated as a separate follow-up (2026-09-09/10, source notebooks: qwen_margin_probe.py and followup_qwen_capacity_window_hypothesis.ipynb) and all three candidate explanations were ruled out in turn:</w:t>
+      </w:r>
+    </w:p>
+    <w:p>
+      <w:pPr>
+        <w:pStyle w:val="ListBullet"/>
+      </w:pPr>
+      <w:r>
+        <w:t>Task-difficulty/margin account: Qwen3-0.6B+LoRA's pre-onset loss relative to chance level (ratio=0.107) sits in the same regime as MNIST's zero-added-noise condition, which showed a LARGE effect (d=2.55) -- not the near-zero-effect regime. If difficulty/margin explained the null, Qwen3 should show a substantial effect too. It doesn't. Ruled out.</w:t>
+      </w:r>
+    </w:p>
+    <w:p>
+      <w:pPr>
+        <w:pStyle w:val="ListBullet"/>
+      </w:pPr>
+      <w:r>
+        <w:t>LoRA capacity: an 8x increase in LoRA rank (8 -&gt; 64, 0.19% -&gt; ~1.5% trainable parameters) produced no change in the tiny, consistent gap between baseline and controller arms (-0.143% vs -0.144% relative loss difference). Ruled out.</w:t>
+      </w:r>
+    </w:p>
+    <w:p>
+      <w:pPr>
+        <w:pStyle w:val="ListBullet"/>
+      </w:pPr>
+      <w:r>
+        <w:t>Post-onset window length: a 3x increase (100 -&gt; 300 steps) similarly produced no change (-0.143% at 100 steps vs -0.126% at 300 steps for rank 8). Ruled out.</w:t>
+      </w:r>
+    </w:p>
+    <w:p>
+      <w:r>
+        <w:t>A methodological note from this follow-up applies project-wide: one test (matching step23c's exact original configuration) nominally survived Holm-Bonferroni correction with a large Cohen's d (-3.505), but inspection of the raw per-seed values showed the underlying difference was only 0.14% relative -- the large d was an artifact of unusually low between-seed variance around a practically negligible effect, not a meaningful finding. Cohen's d measures the consistency of a difference, not its practical size; a very large d alongside very close raw means should prompt inspection of absolute/relative magnitude before being reported as a real effect.</w:t>
+      </w:r>
+    </w:p>
+    <w:p>
+      <w:r>
+        <w:t>With all three candidates ruled out, the most likely remaining explanation -- untested -- is step23c's original suggestion that a pretrained LM's loss landscape near a good initialization is simply more robust to these disturbances than a from-scratch network's, independent of the margin/difficulty measure used here. This remains open.</w:t>
+      </w:r>
+    </w:p>
     <w:sectPr>
       <w:pgSz w:w="12240" w:h="15840"/>
       <w:pgMar w:top="1440" w:right="1800" w:bottom="1440" w:left="1800" w:header="720" w:footer="720" w:gutter="0"/>

</xml_diff>